<commit_message>
Additions / Modifications DURING the FIRST day
</commit_message>
<xml_diff>
--- a/First day afternoon program.docx
+++ b/First day afternoon program.docx
@@ -16,21 +16,16 @@
         <w:sym w:font="Wingdings" w:char="F0E0"/>
       </w:r>
       <w:r>
-        <w:t xml:space="preserve"> the context </w:t>
-      </w:r>
-      <w:proofErr w:type="gramStart"/>
-      <w:r>
-        <w:t>diagram</w:t>
-      </w:r>
-      <w:proofErr w:type="gramEnd"/>
-      <w:r>
-        <w:t xml:space="preserve"> </w:t>
+        <w:t xml:space="preserve"> the context diagram </w:t>
       </w:r>
       <w:r>
         <w:sym w:font="Wingdings" w:char="F0E0"/>
       </w:r>
       <w:r>
         <w:t xml:space="preserve"> the tool for identification of integration points</w:t>
+      </w:r>
+      <w:r>
+        <w:t xml:space="preserve"> with external systems / people</w:t>
       </w:r>
     </w:p>
     <w:p/>

</xml_diff>